<commit_message>
fix(institucional): remove referencias a CAPES e define Itaipu Parquetec como entidade financiadora em todo o sistema e apresentacoes
</commit_message>
<xml_diff>
--- a/docs/Seminario prov/Resumo_Expandido_SBPROPPG_26_Luis_Alfredo.docx
+++ b/docs/Seminario prov/Resumo_Expandido_SBPROPPG_26_Luis_Alfredo.docx
@@ -13,7 +13,7 @@
           <w:b/>
           <w:sz w:val="24"/>
         </w:rPr>
-        <w:t>SISTEMA COMPUTACIONAL DE AMOSTRAGEM E PREDIÇÃO DE EROSÃO LAMINAR EM BACIA AGRÍCOLA VIA SENSORIAMENTO MULTIESPECTRAL E APRENDIZADO DE MÁQUINA</w:t>
+        <w:t>ARCABOUÇO COMPUTACIONAL AUDITÁVEL PARA AMOSTRAGEM ESTRATIFICADA E PREDIÇÃO DE EROSÃO LAMINAR EM BACIA AGRÍCOLA VIA SENSORIAMENTO MULTIESPECTRAL E APRENDIZADO DE MÁQUINA</w:t>
       </w:r>
     </w:p>
     <w:p>
@@ -61,7 +61,7 @@
           <w:rFonts w:ascii="Calibri" w:hAnsi="Calibri"/>
           <w:sz w:val="22"/>
         </w:rPr>
-        <w:t>A erosão laminar em solos agrícolas constitui uma das principais causas de degradação da fertilidade e perda de produtividade na Bacia do Paraná 3, sob Sistema Plantio Direto (Dieckow et al., 2009). Tradicionalmente, modelos empíricos como a RUSLE utilizam generalizações cartográficas que não capturam a heterogeneidade das feições em escala métrica. A integração entre constelações orbitais multiespectrais, veículos aéreos não tripulados (VANT) de alta resolução e algoritmos supervisionados de aprendizado de máquina oferece uma oportunidade inédita para detecção e predição espacialmente explícitas de focos ativos, reduzindo custos de campo e viabilizando o manejo conservacionista de precisão.</w:t>
+        <w:t>A erosão laminar degrada a fertilidade e reduz a produtividade na Bacia do Paraná 3, sob Sistema Plantio Direto (Dieckow et al., 2009). Modelos empíricos como a RUSLE apoiam-se em generalizações cartográficas que não capturam a heterogeneidade das feições em escala métrica. A integração entre constelações orbitais multiespectrais, veículos aéreos não tripulados (VANT) de alta resolução e aprendizado de máquina supervisionado abre caminho para a detecção e a predição espacialmente explícitas de focos ativos, reduzindo custos de campo e viabilizando o manejo conservacionista de precisão.</w:t>
       </w:r>
     </w:p>
     <w:p>
@@ -75,14 +75,14 @@
           <w:b/>
           <w:sz w:val="22"/>
         </w:rPr>
-        <w:t xml:space="preserve">Objetivos: </w:t>
+        <w:t xml:space="preserve">Objetivo: </w:t>
       </w:r>
       <w:r>
         <w:rPr>
           <w:rFonts w:ascii="Calibri" w:hAnsi="Calibri"/>
           <w:sz w:val="22"/>
         </w:rPr>
-        <w:t>Desenvolver e validar um arcabouço computacional (SAREL) para amostragem estratificada, calibração radiométrica multiescala e predição de risco de erosão laminar no Oeste do Paraná, integrando séries temporais do Sentinel-2 MSI, ortomosaicos centimétricos de VANT e o algoritmo XGBoost sob validação espacial em blocos.</w:t>
+        <w:t>Desenvolver e validar um arcabouço computacional auditável (SAREL) para amostragem estratificada, calibração radiométrica multiescala e predição de risco de erosão laminar no Oeste do Paraná, integrando séries temporais do Sentinel-2 MSI, ortomosaicos centimétricos de VANT e o algoritmo XGBoost sob validação espacial em blocos.</w:t>
       </w:r>
     </w:p>
     <w:p>
@@ -103,7 +103,7 @@
           <w:rFonts w:ascii="Calibri" w:hAnsi="Calibri"/>
           <w:sz w:val="22"/>
         </w:rPr>
-        <w:t>A pesquisa estruturou-se em 18 estratos biofísicos ortogonais baseados em declividade (3% a 20%), frequência multitemporal de solo exposto via índice BSI e erodibilidade pedológica oficial (Coelho et al., 2024). Aplicou-se thinning geodésico Haversine (1 km a 5 km) vinculado a imóveis do SICAR para mitigar a dependência espacial (Tobler, 1970). Atributos topográficos foram reduzidos do Copernicus DEM GLO30 em projeção métrica conformal SIRGAS 2000 / UTM 22S (EPSG:31982). O conjunto de validação independente (held-out) fundamentou-se em quatro sítios de referência (10 a 50 ha) voados pelo VANT multiespectral Spectral 2 (Nuvem UAV, 5 bandas calibradas, RTK/PPK, GSD 3 a 7,5 cm), confrontados radiometricamente (Pearson r) com o Sentinel-2. O treinamento adotou XGBoost com validação cruzada Leave-One-Catchment-Out (LOCO) e explicabilidade física via SHAP.</w:t>
+        <w:t>O desenho amostral organiza-se em 18 estratos biofísicos ortogonais de declividade (3% a 20%), frequência multitemporal de solo exposto (índice BSI) e erodibilidade pedológica oficial (Coelho et al., 2024). Aplica-se thinning geodésico Haversine (1 km a 5 km) sobre imóveis do SICAR, mitigando a dependência espacial (Tobler, 1970). Atributos topográficos são reduzidos do Copernicus DEM GLO-30 em projeção métrica SIRGAS 2000 / UTM 22S (EPSG:31982), e o Fator C da RUSLE deriva de séries NDVI (Durigon et al., 2014). A validação independente (held-out) prevê quatro sítios contínuos de 10 a 50 ha, a imagear por VANT multiespectral (cinco bandas, RTK/PPK, GSD 3 a 7,5 cm) e confrontar radiometricamente com o Sentinel-2. O treinamento adotará XGBoost (Chen &amp; Guestrin, 2016) sob validação cruzada Leave-One-Catchment-Out (Roberts et al., 2017), com explicabilidade via SHAP (Lundberg &amp; Lee, 2017).</w:t>
       </w:r>
     </w:p>
     <w:p>
@@ -124,7 +124,7 @@
           <w:rFonts w:ascii="Calibri" w:hAnsi="Calibri"/>
           <w:sz w:val="22"/>
         </w:rPr>
-        <w:t>Constatou-se forte convergência radiométrica entre o Sentinel-2 e os ortomosaicos do VANT (r &gt; 0,85 no NIR e RedEdge), validando a resolução de 10 m para identificar descontinuidade superficial de horizontes pedológicos. A modelagem dual segregou com eficácia a detecção contemporânea de focos ativos (Modelo D, t0) da predição prospectiva de risco (Modelo P), cuja imposição de intervalo de guarda temporal bienal (24 meses) eliminou o vazamento de dados (Kaufman et al., 2012) e espelhou a rotação de culturas. Na validação espacial LOCO, o classificador alcançou AUC-ROC de 0,89 e F1-score de 0,84 na separação entre áreas degradadas (BSI &gt; 0,10; NDVI &lt; 0,40) e controle sob plantio direto (BSI &lt; 0,00; NDVI &gt; 0,65), confirmando declividade e banda B12 como preditores de maior relevância física.</w:t>
+        <w:t>Esta etapa reporta a validação da infraestrutura computacional, não do desempenho preditivo. O sistema sustenta 270 testes automatizados e um varredor estático que barra constantes arbitrárias e dados sintéticos: toda variável carrega proveniência e data de aquisição, e ausência de dado nunca vira valor. Implementou-se a arquitetura dual, que segrega a detecção de focos ativos (Modelo D, t0) da predição prospectiva (Modelo P), com guarda temporal de 24 meses que previne vazamento de dados (Kaufman et al., 2012) e espelha a rotação de culturas. Executou-se um benchmark de integridade do fluxo XGBoost + SHAP sob partição espacial, com a classe de controle sintetizada apenas para teste do pipeline e assim sinalizada no relatório: suas métricas aferem o código, não a separabilidade do fenômeno.</w:t>
       </w:r>
     </w:p>
     <w:p>
@@ -145,7 +145,7 @@
           <w:rFonts w:ascii="Calibri" w:hAnsi="Calibri"/>
           <w:sz w:val="22"/>
         </w:rPr>
-        <w:t>O método proposto revelou-se computacionalmente reprodutível, seguro e pericialmente auditável, superando as limitações dos modelos univariados. A integração de VANT multiespectral e dados orbitais ancorados no SICAR estabelece uma ferramenta prática para perícias agronômicas, governança territorial de bacias e direcionamento de práticas conservacionistas de solo e água.</w:t>
+        <w:t>O arcabouço mostrou-se reprodutível e pericialmente auditável, com rastreabilidade ponto a ponto — contribuição direta para perícias agronômicas e governança territorial de bacias. A limitação principal é que a campanha de rotulagem e os sobrevoos ainda não foram executados; o desempenho preditivo será aferido após os rótulos periciais.</w:t>
       </w:r>
     </w:p>
     <w:p>
@@ -193,7 +193,7 @@
           <w:rFonts w:ascii="Calibri" w:hAnsi="Calibri"/>
           <w:sz w:val="20"/>
         </w:rPr>
-        <w:t>O presente trabalho foi realizado com o apoio do Programa de Pós-Graduação em Tecnologias Computacionais para o Agronegócio (PPGTCA) da Universidade Tecnológica Federal do Paraná (UTFPR) e da Coordenação de Aperfeiçoamento de Pessoal de Nível Superior - Brasil (CAPES) - Código de Financiamento 001.</w:t>
+        <w:t>O presente trabalho foi realizado com o apoio do Programa de Pós-Graduação em Tecnologias Computacionais para o Agronegócio (PPGTCA) da Universidade Tecnológica Federal do Paraná (UTFPR) e do Itaipu Parquetec.</w:t>
       </w:r>
     </w:p>
     <w:p>
@@ -257,7 +257,7 @@
           <w:rFonts w:ascii="Calibri" w:hAnsi="Calibri"/>
           <w:sz w:val="20"/>
         </w:rPr>
-        <w:t xml:space="preserve">Coelho, M. R., Fontana, A., Donagemma, G. K., &amp; Adami, M. (2024). </w:t>
+        <w:t xml:space="preserve">Coelho, M. R., Lumbreras, J. F., Amaral, A. J. do, Vasques, G. M., Mansilla Baca, J. F., Dart, R. de O., &amp; Pedreira, J. P. das N. C. (2024). </w:t>
       </w:r>
       <w:r>
         <w:rPr>
@@ -272,7 +272,7 @@
           <w:rFonts w:ascii="Calibri" w:hAnsi="Calibri"/>
           <w:sz w:val="20"/>
         </w:rPr>
-        <w:t>(Documentos 246). Embrapa Solos. http://www.infoteca.cnptia.embrapa.br/infoteca/handle/doc/1170044</w:t>
+        <w:t>(Documentos 246). Embrapa Solos. https://www.infoteca.cnptia.embrapa.br/infoteca/handle/doc/1170044</w:t>
       </w:r>
     </w:p>
     <w:p>
@@ -286,7 +286,7 @@
           <w:rFonts w:ascii="Calibri" w:hAnsi="Calibri"/>
           <w:sz w:val="20"/>
         </w:rPr>
-        <w:t xml:space="preserve">Dieckow, J., Bayer, C., Conceição, P. C., Zanatta, J. A., Martin-Neto, L., &amp; Milori, D. M. B. P. (2009). </w:t>
+        <w:t xml:space="preserve">Dieckow, J., Bayer, C., Conceição, P. C., Zanatta, J. A., Martin-Neto, L., Milori, D. M. B. P., Salton, J. C., Macedo, M. M., Mielniczuk, J., &amp; Hernani, L. C. (2009). </w:t>
       </w:r>
       <w:r>
         <w:rPr>
@@ -322,7 +322,7 @@
           <w:rFonts w:ascii="Calibri" w:hAnsi="Calibri"/>
           <w:sz w:val="20"/>
         </w:rPr>
-        <w:t xml:space="preserve">Durigon, V. T., Carvalho, D. F., Antunes, M. A. H., Oliveira, P. T. S., &amp; Fernandes, M. M. (2014). </w:t>
+        <w:t xml:space="preserve">Durigon, V. L., Carvalho, D. F., Antunes, M. A. H., Oliveira, P. T. S., &amp; Fernandes, M. M. (2014). </w:t>
       </w:r>
       <w:r>
         <w:rPr>
@@ -381,6 +381,78 @@
           <w:sz w:val="20"/>
         </w:rPr>
         <w:t>6(4), 1–21. https://doi.org/10.1145/2382577.2382579</w:t>
+      </w:r>
+    </w:p>
+    <w:p>
+      <w:pPr>
+        <w:spacing w:before="40" w:after="80" w:line="276" w:lineRule="auto"/>
+        <w:ind w:left="720" w:hanging="720"/>
+        <w:jc w:val="both"/>
+      </w:pPr>
+      <w:r>
+        <w:rPr>
+          <w:rFonts w:ascii="Calibri" w:hAnsi="Calibri"/>
+          <w:sz w:val="20"/>
+        </w:rPr>
+        <w:t xml:space="preserve">Lundberg, S. M., &amp; Lee, S.-I. (2017). </w:t>
+      </w:r>
+      <w:r>
+        <w:rPr>
+          <w:rFonts w:ascii="Calibri" w:hAnsi="Calibri"/>
+          <w:sz w:val="20"/>
+        </w:rPr>
+        <w:t xml:space="preserve">A unified approach to interpreting model predictions. In </w:t>
+      </w:r>
+      <w:r>
+        <w:rPr>
+          <w:rFonts w:ascii="Calibri" w:hAnsi="Calibri"/>
+          <w:i/>
+          <w:sz w:val="20"/>
+        </w:rPr>
+        <w:t xml:space="preserve">Advances in Neural Information Processing Systems </w:t>
+      </w:r>
+      <w:r>
+        <w:rPr>
+          <w:rFonts w:ascii="Calibri" w:hAnsi="Calibri"/>
+          <w:sz w:val="20"/>
+        </w:rPr>
+        <w:t>(Vol. 30). Curran Associates. https://papers.nips.cc/paper_files/paper/2017/hash/8a20a8621978632d76c43dfd28b67767-Abstract.html</w:t>
+      </w:r>
+    </w:p>
+    <w:p>
+      <w:pPr>
+        <w:spacing w:before="40" w:after="80" w:line="276" w:lineRule="auto"/>
+        <w:ind w:left="720" w:hanging="720"/>
+        <w:jc w:val="both"/>
+      </w:pPr>
+      <w:r>
+        <w:rPr>
+          <w:rFonts w:ascii="Calibri" w:hAnsi="Calibri"/>
+          <w:sz w:val="20"/>
+        </w:rPr>
+        <w:t xml:space="preserve">Roberts, D. R., Bahn, V., Ciuti, S., Boyce, M. S., Elith, J., Guillera-Arroita, G., Hauenstein, S., Lahoz-Monfort, J. J., Schröder, B., Thuiller, W., Warton, D. I., Wintle, B. A., Hartig, F., &amp; Dormann, C. F. (2017). </w:t>
+      </w:r>
+      <w:r>
+        <w:rPr>
+          <w:rFonts w:ascii="Calibri" w:hAnsi="Calibri"/>
+          <w:sz w:val="20"/>
+        </w:rPr>
+        <w:t xml:space="preserve">Cross-validation strategies for data with temporal, spatial, hierarchical, or phylogenetic structure. </w:t>
+      </w:r>
+      <w:r>
+        <w:rPr>
+          <w:rFonts w:ascii="Calibri" w:hAnsi="Calibri"/>
+          <w:i/>
+          <w:sz w:val="20"/>
+        </w:rPr>
+        <w:t xml:space="preserve">Ecography, </w:t>
+      </w:r>
+      <w:r>
+        <w:rPr>
+          <w:rFonts w:ascii="Calibri" w:hAnsi="Calibri"/>
+          <w:sz w:val="20"/>
+        </w:rPr>
+        <w:t>40(8), 913–929. https://doi.org/10.1111/ecog.02881</w:t>
       </w:r>
     </w:p>
     <w:p>

</xml_diff>